<commit_message>
Lab 4: update chat history docx
</commit_message>
<xml_diff>
--- a/lab4-vibecoding/docs/PES2UG24CS019_SE_Lab4_chat.docx
+++ b/lab4-vibecoding/docs/PES2UG24CS019_SE_Lab4_chat.docx
@@ -95,6 +95,15 @@
           <w:sz w:val="19"/>
           <w:szCs w:val="19"/>
         </w:rPr>
+        <w:t>, Ter</w:t>
+      </w:r>
+      <w:r>
+        <w:rPr>
+          <w:rFonts w:ascii="Calibri" w:eastAsia="Times New Roman" w:hAnsi="Calibri" w:cs="Calibri"/>
+          <w:color w:val="333333"/>
+          <w:sz w:val="19"/>
+          <w:szCs w:val="19"/>
+        </w:rPr>
         <w:br/>
       </w:r>
       <w:r>
@@ -150,47 +159,7 @@
           <w:sz w:val="19"/>
           <w:szCs w:val="19"/>
         </w:rPr>
-        <w:t xml:space="preserve">Yes, </w:t>
-      </w:r>
-      <w:proofErr w:type="gramStart"/>
-      <w:r>
-        <w:rPr>
-          <w:rFonts w:ascii="Calibri" w:hAnsi="Calibri" w:cs="Calibri"/>
-          <w:color w:val="000000"/>
-          <w:sz w:val="19"/>
-          <w:szCs w:val="19"/>
-        </w:rPr>
-        <w:t>the .gitignore</w:t>
-      </w:r>
-      <w:proofErr w:type="gramEnd"/>
-      <w:r>
-        <w:rPr>
-          <w:rFonts w:ascii="Calibri" w:hAnsi="Calibri" w:cs="Calibri"/>
-          <w:color w:val="000000"/>
-          <w:sz w:val="19"/>
-          <w:szCs w:val="19"/>
-        </w:rPr>
-        <w:t xml:space="preserve"> will have those two files. Check all the lab folders and file these two the same way. Then </w:t>
-      </w:r>
-      <w:proofErr w:type="gramStart"/>
-      <w:r>
-        <w:rPr>
-          <w:rFonts w:ascii="Calibri" w:hAnsi="Calibri" w:cs="Calibri"/>
-          <w:color w:val="000000"/>
-          <w:sz w:val="19"/>
-          <w:szCs w:val="19"/>
-        </w:rPr>
-        <w:t>start</w:t>
-      </w:r>
-      <w:proofErr w:type="gramEnd"/>
-      <w:r>
-        <w:rPr>
-          <w:rFonts w:ascii="Calibri" w:hAnsi="Calibri" w:cs="Calibri"/>
-          <w:color w:val="000000"/>
-          <w:sz w:val="19"/>
-          <w:szCs w:val="19"/>
-        </w:rPr>
-        <w:t xml:space="preserve"> guiding me through Lab 4.</w:t>
+        <w:t>Yes, the .gitignore will have those two files. Check all the lab folders and file these two the same way. Then start guiding me through Lab 4.</w:t>
       </w:r>
     </w:p>
     <w:p>
@@ -214,10 +183,12 @@
           <w:sz w:val="14"/>
           <w:szCs w:val="14"/>
         </w:rPr>
-        <w:t xml:space="preserve">Claude checked the lab folders, moved the handout and allocation sheet into lab4-vibecoding/handout/, </w:t>
-      </w:r>
-      <w:proofErr w:type="gramStart"/>
-      <w:r>
+        <w:t>Claude checked the lab folders, moved the handout and allocation sheet into lab4-vibecoding/handout/, updated .gitignore and read the assigned repo.</w:t>
+      </w:r>
+    </w:p>
+    <w:p>
+      <w:pPr>
+        <w:divId w:val="343092489"/>
         <w:rPr>
           <w:rFonts w:ascii="Calibri" w:eastAsia="Times New Roman" w:hAnsi="Calibri" w:cs="Calibri"/>
           <w:i/>
@@ -226,9 +197,7 @@
           <w:sz w:val="14"/>
           <w:szCs w:val="14"/>
         </w:rPr>
-        <w:t>updated .gitignore</w:t>
-      </w:r>
-      <w:proofErr w:type="gramEnd"/>
+      </w:pPr>
       <w:r>
         <w:rPr>
           <w:rFonts w:ascii="Calibri" w:eastAsia="Times New Roman" w:hAnsi="Calibri" w:cs="Calibri"/>
@@ -238,55 +207,7 @@
           <w:sz w:val="14"/>
           <w:szCs w:val="14"/>
         </w:rPr>
-        <w:t xml:space="preserve"> and read the assigned repo.</w:t>
-      </w:r>
-    </w:p>
-    <w:p>
-      <w:pPr>
-        <w:divId w:val="343092489"/>
-        <w:rPr>
-          <w:rFonts w:ascii="Calibri" w:eastAsia="Times New Roman" w:hAnsi="Calibri" w:cs="Calibri"/>
-          <w:i/>
-          <w:iCs/>
-          <w:color w:val="777777"/>
-          <w:sz w:val="14"/>
-          <w:szCs w:val="14"/>
-        </w:rPr>
-      </w:pPr>
-      <w:r>
-        <w:rPr>
-          <w:rFonts w:ascii="Calibri" w:eastAsia="Times New Roman" w:hAnsi="Calibri" w:cs="Calibri"/>
-          <w:i/>
-          <w:iCs/>
-          <w:color w:val="777777"/>
-          <w:sz w:val="14"/>
-          <w:szCs w:val="14"/>
-        </w:rPr>
-        <w:t xml:space="preserve">Ran: git status --short --ignored. The handout folder shows as ignored, </w:t>
-      </w:r>
-      <w:proofErr w:type="gramStart"/>
-      <w:r>
-        <w:rPr>
-          <w:rFonts w:ascii="Calibri" w:eastAsia="Times New Roman" w:hAnsi="Calibri" w:cs="Calibri"/>
-          <w:i/>
-          <w:iCs/>
-          <w:color w:val="777777"/>
-          <w:sz w:val="14"/>
-          <w:szCs w:val="14"/>
-        </w:rPr>
-        <w:t>only .gitignore</w:t>
-      </w:r>
-      <w:proofErr w:type="gramEnd"/>
-      <w:r>
-        <w:rPr>
-          <w:rFonts w:ascii="Calibri" w:eastAsia="Times New Roman" w:hAnsi="Calibri" w:cs="Calibri"/>
-          <w:i/>
-          <w:iCs/>
-          <w:color w:val="777777"/>
-          <w:sz w:val="14"/>
-          <w:szCs w:val="14"/>
-        </w:rPr>
-        <w:t xml:space="preserve"> is modified.</w:t>
+        <w:t>Ran: git status --short --ignored. The handout folder shows as ignored, only .gitignore is modified.</w:t>
       </w:r>
     </w:p>
     <w:p>
@@ -347,17 +268,7 @@
           <w:sz w:val="19"/>
           <w:szCs w:val="19"/>
         </w:rPr>
-        <w:t xml:space="preserve"> folder, </w:t>
-      </w:r>
-      <w:proofErr w:type="gramStart"/>
-      <w:r>
-        <w:rPr>
-          <w:rFonts w:ascii="Calibri" w:hAnsi="Calibri" w:cs="Calibri"/>
-          <w:color w:val="000000"/>
-          <w:sz w:val="19"/>
-          <w:szCs w:val="19"/>
-        </w:rPr>
-        <w:t xml:space="preserve">and </w:t>
+        <w:t xml:space="preserve"> folder, and </w:t>
       </w:r>
       <w:r>
         <w:rPr>
@@ -366,7 +277,6 @@
         </w:rPr>
         <w:t>.gitignore</w:t>
       </w:r>
-      <w:proofErr w:type="gramEnd"/>
       <w:r>
         <w:rPr>
           <w:rFonts w:ascii="Calibri" w:hAnsi="Calibri" w:cs="Calibri"/>
@@ -787,23 +697,7 @@
           <w:rStyle w:val="HTMLCode"/>
           <w:color w:val="000000"/>
         </w:rPr>
-        <w:t xml:space="preserve">for _ in </w:t>
-      </w:r>
-      <w:proofErr w:type="gramStart"/>
-      <w:r>
-        <w:rPr>
-          <w:rStyle w:val="HTMLCode"/>
-          <w:color w:val="000000"/>
-        </w:rPr>
-        <w:t>range(</w:t>
-      </w:r>
-      <w:proofErr w:type="gramEnd"/>
-      <w:r>
-        <w:rPr>
-          <w:rStyle w:val="HTMLCode"/>
-          <w:color w:val="000000"/>
-        </w:rPr>
-        <w:t>6)</w:t>
+        <w:t>for _ in range(6)</w:t>
       </w:r>
       <w:r>
         <w:rPr>
@@ -950,17 +844,7 @@
           <w:sz w:val="19"/>
           <w:szCs w:val="19"/>
         </w:rPr>
-        <w:t xml:space="preserve"> You clone the repo next to your lab repo (not inside it, so there is no </w:t>
-      </w:r>
-      <w:proofErr w:type="gramStart"/>
-      <w:r>
-        <w:rPr>
-          <w:rFonts w:ascii="Calibri" w:hAnsi="Calibri" w:cs="Calibri"/>
-          <w:color w:val="000000"/>
-          <w:sz w:val="19"/>
-          <w:szCs w:val="19"/>
-        </w:rPr>
-        <w:t xml:space="preserve">nested </w:t>
+        <w:t xml:space="preserve"> You clone the repo next to your lab repo (not inside it, so there is no nested </w:t>
       </w:r>
       <w:r>
         <w:rPr>
@@ -969,7 +853,6 @@
         </w:rPr>
         <w:t>.git</w:t>
       </w:r>
-      <w:proofErr w:type="gramEnd"/>
       <w:r>
         <w:rPr>
           <w:rFonts w:ascii="Calibri" w:hAnsi="Calibri" w:cs="Calibri"/>
@@ -1718,27 +1601,7 @@
                 <w:sz w:val="19"/>
                 <w:szCs w:val="19"/>
               </w:rPr>
-              <w:t xml:space="preserve">yellow gray </w:t>
-            </w:r>
-            <w:proofErr w:type="gramStart"/>
-            <w:r>
-              <w:rPr>
-                <w:rFonts w:ascii="Calibri" w:eastAsia="Times New Roman" w:hAnsi="Calibri" w:cs="Calibri"/>
-                <w:color w:val="000000"/>
-                <w:sz w:val="19"/>
-                <w:szCs w:val="19"/>
-              </w:rPr>
-              <w:t>green yellow</w:t>
-            </w:r>
-            <w:proofErr w:type="gramEnd"/>
-            <w:r>
-              <w:rPr>
-                <w:rFonts w:ascii="Calibri" w:eastAsia="Times New Roman" w:hAnsi="Calibri" w:cs="Calibri"/>
-                <w:color w:val="000000"/>
-                <w:sz w:val="19"/>
-                <w:szCs w:val="19"/>
-              </w:rPr>
-              <w:t xml:space="preserve"> </w:t>
+              <w:t xml:space="preserve">yellow gray green yellow </w:t>
             </w:r>
             <w:r>
               <w:rPr>
@@ -1786,27 +1649,7 @@
                 <w:sz w:val="19"/>
                 <w:szCs w:val="19"/>
               </w:rPr>
-              <w:t xml:space="preserve">yellow gray </w:t>
-            </w:r>
-            <w:proofErr w:type="gramStart"/>
-            <w:r>
-              <w:rPr>
-                <w:rFonts w:ascii="Calibri" w:eastAsia="Times New Roman" w:hAnsi="Calibri" w:cs="Calibri"/>
-                <w:color w:val="000000"/>
-                <w:sz w:val="19"/>
-                <w:szCs w:val="19"/>
-              </w:rPr>
-              <w:t>green yellow</w:t>
-            </w:r>
-            <w:proofErr w:type="gramEnd"/>
-            <w:r>
-              <w:rPr>
-                <w:rFonts w:ascii="Calibri" w:eastAsia="Times New Roman" w:hAnsi="Calibri" w:cs="Calibri"/>
-                <w:color w:val="000000"/>
-                <w:sz w:val="19"/>
-                <w:szCs w:val="19"/>
-              </w:rPr>
-              <w:t xml:space="preserve"> </w:t>
+              <w:t xml:space="preserve">yellow gray green yellow </w:t>
             </w:r>
             <w:r>
               <w:rPr>
@@ -1965,7 +1808,6 @@
                 <w:szCs w:val="19"/>
               </w:rPr>
             </w:pPr>
-            <w:proofErr w:type="gramStart"/>
             <w:r>
               <w:rPr>
                 <w:rFonts w:ascii="Calibri" w:eastAsia="Times New Roman" w:hAnsi="Calibri" w:cs="Calibri"/>
@@ -1973,27 +1815,7 @@
                 <w:sz w:val="19"/>
                 <w:szCs w:val="19"/>
               </w:rPr>
-              <w:t>green green</w:t>
-            </w:r>
-            <w:proofErr w:type="gramEnd"/>
-            <w:r>
-              <w:rPr>
-                <w:rFonts w:ascii="Calibri" w:eastAsia="Times New Roman" w:hAnsi="Calibri" w:cs="Calibri"/>
-                <w:color w:val="000000"/>
-                <w:sz w:val="19"/>
-                <w:szCs w:val="19"/>
-              </w:rPr>
-              <w:t xml:space="preserve"> yellow </w:t>
-            </w:r>
-            <w:proofErr w:type="gramStart"/>
-            <w:r>
-              <w:rPr>
-                <w:rFonts w:ascii="Calibri" w:eastAsia="Times New Roman" w:hAnsi="Calibri" w:cs="Calibri"/>
-                <w:color w:val="000000"/>
-                <w:sz w:val="19"/>
-                <w:szCs w:val="19"/>
-              </w:rPr>
-              <w:t xml:space="preserve">yellow </w:t>
+              <w:t xml:space="preserve">green green yellow yellow </w:t>
             </w:r>
             <w:r>
               <w:rPr>
@@ -2005,7 +1827,6 @@
               </w:rPr>
               <w:t>yellow</w:t>
             </w:r>
-            <w:proofErr w:type="gramEnd"/>
           </w:p>
         </w:tc>
         <w:tc>
@@ -2035,7 +1856,6 @@
                 <w:szCs w:val="19"/>
               </w:rPr>
             </w:pPr>
-            <w:proofErr w:type="gramStart"/>
             <w:r>
               <w:rPr>
                 <w:rFonts w:ascii="Calibri" w:eastAsia="Times New Roman" w:hAnsi="Calibri" w:cs="Calibri"/>
@@ -2043,17 +1863,7 @@
                 <w:sz w:val="19"/>
                 <w:szCs w:val="19"/>
               </w:rPr>
-              <w:t>green green</w:t>
-            </w:r>
-            <w:proofErr w:type="gramEnd"/>
-            <w:r>
-              <w:rPr>
-                <w:rFonts w:ascii="Calibri" w:eastAsia="Times New Roman" w:hAnsi="Calibri" w:cs="Calibri"/>
-                <w:color w:val="000000"/>
-                <w:sz w:val="19"/>
-                <w:szCs w:val="19"/>
-              </w:rPr>
-              <w:t xml:space="preserve"> yellow yellow </w:t>
+              <w:t xml:space="preserve">green green yellow yellow </w:t>
             </w:r>
             <w:r>
               <w:rPr>
@@ -2094,7 +1904,6 @@
                 <w:szCs w:val="19"/>
               </w:rPr>
             </w:pPr>
-            <w:proofErr w:type="gramStart"/>
             <w:r>
               <w:rPr>
                 <w:rFonts w:ascii="Calibri" w:eastAsia="Times New Roman" w:hAnsi="Calibri" w:cs="Calibri"/>
@@ -2102,17 +1911,7 @@
                 <w:sz w:val="19"/>
                 <w:szCs w:val="19"/>
               </w:rPr>
-              <w:t>the</w:t>
-            </w:r>
-            <w:proofErr w:type="gramEnd"/>
-            <w:r>
-              <w:rPr>
-                <w:rFonts w:ascii="Calibri" w:eastAsia="Times New Roman" w:hAnsi="Calibri" w:cs="Calibri"/>
-                <w:color w:val="000000"/>
-                <w:sz w:val="19"/>
-                <w:szCs w:val="19"/>
-              </w:rPr>
-              <w:t xml:space="preserve"> only </w:t>
+              <w:t xml:space="preserve">the only </w:t>
             </w:r>
             <w:r>
               <w:rPr>
@@ -2200,7 +1999,6 @@
                 <w:szCs w:val="19"/>
               </w:rPr>
             </w:pPr>
-            <w:proofErr w:type="gramStart"/>
             <w:r>
               <w:rPr>
                 <w:rFonts w:ascii="Calibri" w:eastAsia="Times New Roman" w:hAnsi="Calibri" w:cs="Calibri"/>
@@ -2208,27 +2006,7 @@
                 <w:sz w:val="19"/>
                 <w:szCs w:val="19"/>
               </w:rPr>
-              <w:t>green green</w:t>
-            </w:r>
-            <w:proofErr w:type="gramEnd"/>
-            <w:r>
-              <w:rPr>
-                <w:rFonts w:ascii="Calibri" w:eastAsia="Times New Roman" w:hAnsi="Calibri" w:cs="Calibri"/>
-                <w:color w:val="000000"/>
-                <w:sz w:val="19"/>
-                <w:szCs w:val="19"/>
-              </w:rPr>
-              <w:t xml:space="preserve"> green </w:t>
-            </w:r>
-            <w:proofErr w:type="gramStart"/>
-            <w:r>
-              <w:rPr>
-                <w:rFonts w:ascii="Calibri" w:eastAsia="Times New Roman" w:hAnsi="Calibri" w:cs="Calibri"/>
-                <w:color w:val="000000"/>
-                <w:sz w:val="19"/>
-                <w:szCs w:val="19"/>
-              </w:rPr>
-              <w:t xml:space="preserve">green </w:t>
+              <w:t xml:space="preserve">green green green green </w:t>
             </w:r>
             <w:r>
               <w:rPr>
@@ -2240,7 +2018,6 @@
               </w:rPr>
               <w:t>yellow</w:t>
             </w:r>
-            <w:proofErr w:type="gramEnd"/>
           </w:p>
         </w:tc>
         <w:tc>
@@ -2270,7 +2047,6 @@
                 <w:szCs w:val="19"/>
               </w:rPr>
             </w:pPr>
-            <w:proofErr w:type="gramStart"/>
             <w:r>
               <w:rPr>
                 <w:rFonts w:ascii="Calibri" w:eastAsia="Times New Roman" w:hAnsi="Calibri" w:cs="Calibri"/>
@@ -2278,27 +2054,7 @@
                 <w:sz w:val="19"/>
                 <w:szCs w:val="19"/>
               </w:rPr>
-              <w:t>green green</w:t>
-            </w:r>
-            <w:proofErr w:type="gramEnd"/>
-            <w:r>
-              <w:rPr>
-                <w:rFonts w:ascii="Calibri" w:eastAsia="Times New Roman" w:hAnsi="Calibri" w:cs="Calibri"/>
-                <w:color w:val="000000"/>
-                <w:sz w:val="19"/>
-                <w:szCs w:val="19"/>
-              </w:rPr>
-              <w:t xml:space="preserve"> green </w:t>
-            </w:r>
-            <w:proofErr w:type="gramStart"/>
-            <w:r>
-              <w:rPr>
-                <w:rFonts w:ascii="Calibri" w:eastAsia="Times New Roman" w:hAnsi="Calibri" w:cs="Calibri"/>
-                <w:color w:val="000000"/>
-                <w:sz w:val="19"/>
-                <w:szCs w:val="19"/>
-              </w:rPr>
-              <w:t xml:space="preserve">green </w:t>
+              <w:t xml:space="preserve">green green green green </w:t>
             </w:r>
             <w:r>
               <w:rPr>
@@ -2310,7 +2066,6 @@
               </w:rPr>
               <w:t>gray</w:t>
             </w:r>
-            <w:proofErr w:type="gramEnd"/>
           </w:p>
         </w:tc>
         <w:tc>
@@ -2420,7 +2175,6 @@
                 <w:szCs w:val="19"/>
               </w:rPr>
             </w:pPr>
-            <w:proofErr w:type="gramStart"/>
             <w:r>
               <w:rPr>
                 <w:rFonts w:ascii="Calibri" w:eastAsia="Times New Roman" w:hAnsi="Calibri" w:cs="Calibri"/>
@@ -2428,27 +2182,7 @@
                 <w:sz w:val="19"/>
                 <w:szCs w:val="19"/>
               </w:rPr>
-              <w:t>green green</w:t>
-            </w:r>
-            <w:proofErr w:type="gramEnd"/>
-            <w:r>
-              <w:rPr>
-                <w:rFonts w:ascii="Calibri" w:eastAsia="Times New Roman" w:hAnsi="Calibri" w:cs="Calibri"/>
-                <w:color w:val="000000"/>
-                <w:sz w:val="19"/>
-                <w:szCs w:val="19"/>
-              </w:rPr>
-              <w:t xml:space="preserve"> green </w:t>
-            </w:r>
-            <w:proofErr w:type="gramStart"/>
-            <w:r>
-              <w:rPr>
-                <w:rFonts w:ascii="Calibri" w:eastAsia="Times New Roman" w:hAnsi="Calibri" w:cs="Calibri"/>
-                <w:color w:val="000000"/>
-                <w:sz w:val="19"/>
-                <w:szCs w:val="19"/>
-              </w:rPr>
-              <w:t xml:space="preserve">green </w:t>
+              <w:t xml:space="preserve">green green green green </w:t>
             </w:r>
             <w:r>
               <w:rPr>
@@ -2460,7 +2194,6 @@
               </w:rPr>
               <w:t>yellow</w:t>
             </w:r>
-            <w:proofErr w:type="gramEnd"/>
           </w:p>
         </w:tc>
         <w:tc>
@@ -2490,7 +2223,6 @@
                 <w:szCs w:val="19"/>
               </w:rPr>
             </w:pPr>
-            <w:proofErr w:type="gramStart"/>
             <w:r>
               <w:rPr>
                 <w:rFonts w:ascii="Calibri" w:eastAsia="Times New Roman" w:hAnsi="Calibri" w:cs="Calibri"/>
@@ -2498,27 +2230,7 @@
                 <w:sz w:val="19"/>
                 <w:szCs w:val="19"/>
               </w:rPr>
-              <w:t>green green</w:t>
-            </w:r>
-            <w:proofErr w:type="gramEnd"/>
-            <w:r>
-              <w:rPr>
-                <w:rFonts w:ascii="Calibri" w:eastAsia="Times New Roman" w:hAnsi="Calibri" w:cs="Calibri"/>
-                <w:color w:val="000000"/>
-                <w:sz w:val="19"/>
-                <w:szCs w:val="19"/>
-              </w:rPr>
-              <w:t xml:space="preserve"> green </w:t>
-            </w:r>
-            <w:proofErr w:type="gramStart"/>
-            <w:r>
-              <w:rPr>
-                <w:rFonts w:ascii="Calibri" w:eastAsia="Times New Roman" w:hAnsi="Calibri" w:cs="Calibri"/>
-                <w:color w:val="000000"/>
-                <w:sz w:val="19"/>
-                <w:szCs w:val="19"/>
-              </w:rPr>
-              <w:t xml:space="preserve">green </w:t>
+              <w:t xml:space="preserve">green green green green </w:t>
             </w:r>
             <w:r>
               <w:rPr>
@@ -2530,7 +2242,6 @@
               </w:rPr>
               <w:t>gray</w:t>
             </w:r>
-            <w:proofErr w:type="gramEnd"/>
           </w:p>
         </w:tc>
         <w:tc>
@@ -2560,7 +2271,6 @@
                 <w:szCs w:val="19"/>
               </w:rPr>
             </w:pPr>
-            <w:proofErr w:type="gramStart"/>
             <w:r>
               <w:rPr>
                 <w:rFonts w:ascii="Calibri" w:eastAsia="Times New Roman" w:hAnsi="Calibri" w:cs="Calibri"/>
@@ -2568,17 +2278,7 @@
                 <w:sz w:val="19"/>
                 <w:szCs w:val="19"/>
               </w:rPr>
-              <w:t>the</w:t>
-            </w:r>
-            <w:proofErr w:type="gramEnd"/>
-            <w:r>
-              <w:rPr>
-                <w:rFonts w:ascii="Calibri" w:eastAsia="Times New Roman" w:hAnsi="Calibri" w:cs="Calibri"/>
-                <w:color w:val="000000"/>
-                <w:sz w:val="19"/>
-                <w:szCs w:val="19"/>
-              </w:rPr>
-              <w:t xml:space="preserve"> only </w:t>
+              <w:t xml:space="preserve">the only </w:t>
             </w:r>
             <w:r>
               <w:rPr>
@@ -2749,31 +2449,7 @@
           <w:sz w:val="19"/>
           <w:szCs w:val="19"/>
         </w:rPr>
-        <w:t xml:space="preserve">I will then proceed to add a small test file for </w:t>
-      </w:r>
-      <w:proofErr w:type="gramStart"/>
-      <w:r>
-        <w:rPr>
-          <w:rFonts w:ascii="Calibri" w:hAnsi="Calibri" w:cs="Calibri"/>
-          <w:b/>
-          <w:bCs/>
-          <w:color w:val="000000"/>
-          <w:sz w:val="19"/>
-          <w:szCs w:val="19"/>
-        </w:rPr>
-        <w:t>the README's</w:t>
-      </w:r>
-      <w:proofErr w:type="gramEnd"/>
-      <w:r>
-        <w:rPr>
-          <w:rFonts w:ascii="Calibri" w:hAnsi="Calibri" w:cs="Calibri"/>
-          <w:b/>
-          <w:bCs/>
-          <w:color w:val="000000"/>
-          <w:sz w:val="19"/>
-          <w:szCs w:val="19"/>
-        </w:rPr>
-        <w:t xml:space="preserve"> required test cases. </w:t>
+        <w:t xml:space="preserve">I will then proceed to add a small test file for the README's required test cases. </w:t>
       </w:r>
     </w:p>
     <w:p>
@@ -2816,25 +2492,14 @@
         </w:rPr>
         <w:t xml:space="preserve"> </w:t>
       </w:r>
-      <w:proofErr w:type="gramStart"/>
-      <w:r>
-        <w:rPr>
-          <w:rFonts w:ascii="Calibri" w:hAnsi="Calibri" w:cs="Calibri"/>
-          <w:color w:val="000000"/>
-          <w:sz w:val="19"/>
-          <w:szCs w:val="19"/>
-        </w:rPr>
-        <w:t>Screenshots</w:t>
-      </w:r>
-      <w:proofErr w:type="gramEnd"/>
-      <w:r>
-        <w:rPr>
-          <w:rFonts w:ascii="Calibri" w:hAnsi="Calibri" w:cs="Calibri"/>
-          <w:color w:val="000000"/>
-          <w:sz w:val="19"/>
-          <w:szCs w:val="19"/>
-        </w:rPr>
-        <w:t xml:space="preserve"> go in </w:t>
+      <w:r>
+        <w:rPr>
+          <w:rFonts w:ascii="Calibri" w:hAnsi="Calibri" w:cs="Calibri"/>
+          <w:color w:val="000000"/>
+          <w:sz w:val="19"/>
+          <w:szCs w:val="19"/>
+        </w:rPr>
+        <w:t xml:space="preserve">Screenshots go in </w:t>
       </w:r>
       <w:r>
         <w:rPr>
@@ -2959,27 +2624,7 @@
           <w:sz w:val="19"/>
           <w:szCs w:val="19"/>
         </w:rPr>
-        <w:t xml:space="preserve">Let's do </w:t>
-      </w:r>
-      <w:proofErr w:type="gramStart"/>
-      <w:r>
-        <w:rPr>
-          <w:rFonts w:ascii="Calibri" w:hAnsi="Calibri" w:cs="Calibri"/>
-          <w:color w:val="000000"/>
-          <w:sz w:val="19"/>
-          <w:szCs w:val="19"/>
-        </w:rPr>
-        <w:t>the Lab</w:t>
-      </w:r>
-      <w:proofErr w:type="gramEnd"/>
-      <w:r>
-        <w:rPr>
-          <w:rFonts w:ascii="Calibri" w:hAnsi="Calibri" w:cs="Calibri"/>
-          <w:color w:val="000000"/>
-          <w:sz w:val="19"/>
-          <w:szCs w:val="19"/>
-        </w:rPr>
-        <w:t xml:space="preserve"> 4 work now, task by task. Please:</w:t>
+        <w:t>Let's do the Lab 4 work now, task by task. Please:</w:t>
       </w:r>
       <w:r>
         <w:rPr>
@@ -3056,25 +2701,14 @@
           <w:szCs w:val="19"/>
         </w:rPr>
       </w:pPr>
-      <w:proofErr w:type="gramStart"/>
-      <w:r>
-        <w:rPr>
-          <w:rFonts w:ascii="Calibri" w:eastAsia="Times New Roman" w:hAnsi="Calibri" w:cs="Calibri"/>
-          <w:color w:val="000000"/>
-          <w:sz w:val="19"/>
-          <w:szCs w:val="19"/>
-        </w:rPr>
-        <w:t>tell</w:t>
-      </w:r>
-      <w:proofErr w:type="gramEnd"/>
-      <w:r>
-        <w:rPr>
-          <w:rFonts w:ascii="Calibri" w:eastAsia="Times New Roman" w:hAnsi="Calibri" w:cs="Calibri"/>
-          <w:color w:val="000000"/>
-          <w:sz w:val="19"/>
-          <w:szCs w:val="19"/>
-        </w:rPr>
-        <w:t xml:space="preserve"> me what to push and give me the GitHub link for Lab 4</w:t>
+      <w:r>
+        <w:rPr>
+          <w:rFonts w:ascii="Calibri" w:eastAsia="Times New Roman" w:hAnsi="Calibri" w:cs="Calibri"/>
+          <w:color w:val="000000"/>
+          <w:sz w:val="19"/>
+          <w:szCs w:val="19"/>
+        </w:rPr>
+        <w:t>tell me what to push and give me the GitHub link for Lab 4</w:t>
       </w:r>
     </w:p>
     <w:p>
@@ -4097,23 +3731,7 @@
           <w:rStyle w:val="HTMLCode"/>
           <w:color w:val="000000"/>
         </w:rPr>
-        <w:t xml:space="preserve">def </w:t>
-      </w:r>
-      <w:proofErr w:type="gramStart"/>
-      <w:r>
-        <w:rPr>
-          <w:rStyle w:val="HTMLCode"/>
-          <w:color w:val="000000"/>
-        </w:rPr>
-        <w:t>evaluate(</w:t>
-      </w:r>
-      <w:proofErr w:type="gramEnd"/>
-      <w:r>
-        <w:rPr>
-          <w:rStyle w:val="HTMLCode"/>
-          <w:color w:val="000000"/>
-        </w:rPr>
-        <w:t>target, guess):</w:t>
+        <w:t>def evaluate(target, guess):</w:t>
       </w:r>
     </w:p>
     <w:p>
@@ -4185,23 +3803,7 @@
           <w:rStyle w:val="HTMLCode"/>
           <w:color w:val="000000"/>
         </w:rPr>
-        <w:t xml:space="preserve">    unmatched = </w:t>
-      </w:r>
-      <w:proofErr w:type="gramStart"/>
-      <w:r>
-        <w:rPr>
-          <w:rStyle w:val="HTMLCode"/>
-          <w:color w:val="000000"/>
-        </w:rPr>
-        <w:t>Counter(</w:t>
-      </w:r>
-      <w:proofErr w:type="gramEnd"/>
-      <w:r>
-        <w:rPr>
-          <w:rStyle w:val="HTMLCode"/>
-          <w:color w:val="000000"/>
-        </w:rPr>
-        <w:t>)</w:t>
+        <w:t xml:space="preserve">    unmatched = Counter()</w:t>
       </w:r>
     </w:p>
     <w:p>
@@ -4237,23 +3839,7 @@
           <w:rStyle w:val="HTMLCode"/>
           <w:color w:val="000000"/>
         </w:rPr>
-        <w:t xml:space="preserve">    for i, (t, g) in </w:t>
-      </w:r>
-      <w:proofErr w:type="gramStart"/>
-      <w:r>
-        <w:rPr>
-          <w:rStyle w:val="HTMLCode"/>
-          <w:color w:val="000000"/>
-        </w:rPr>
-        <w:t>enumerate(zip(</w:t>
-      </w:r>
-      <w:proofErr w:type="gramEnd"/>
-      <w:r>
-        <w:rPr>
-          <w:rStyle w:val="HTMLCode"/>
-          <w:color w:val="000000"/>
-        </w:rPr>
-        <w:t>target, guess)):</w:t>
+        <w:t xml:space="preserve">    for i, (t, g) in enumerate(zip(target, guess)):</w:t>
       </w:r>
     </w:p>
     <w:p>
@@ -4469,23 +4055,7 @@
           <w:rStyle w:val="HTMLCode"/>
           <w:color w:val="000000"/>
         </w:rPr>
-        <w:t xml:space="preserve">        if result[i</w:t>
-      </w:r>
-      <w:proofErr w:type="gramStart"/>
-      <w:r>
-        <w:rPr>
-          <w:rStyle w:val="HTMLCode"/>
-          <w:color w:val="000000"/>
-        </w:rPr>
-        <w:t>] !</w:t>
-      </w:r>
-      <w:proofErr w:type="gramEnd"/>
-      <w:r>
-        <w:rPr>
-          <w:rStyle w:val="HTMLCode"/>
-          <w:color w:val="000000"/>
-        </w:rPr>
-        <w:t>= "green" and unmatched[g] &gt; 0:</w:t>
+        <w:t xml:space="preserve">        if result[i] != "green" and unmatched[g] &gt; 0:</w:t>
       </w:r>
     </w:p>
     <w:p>
@@ -4650,23 +4220,7 @@
           <w:rStyle w:val="HTMLCode"/>
           <w:color w:val="000000"/>
         </w:rPr>
-        <w:t>while len(</w:t>
-      </w:r>
-      <w:proofErr w:type="gramStart"/>
-      <w:r>
-        <w:rPr>
-          <w:rStyle w:val="HTMLCode"/>
-          <w:color w:val="000000"/>
-        </w:rPr>
-        <w:t>self.history</w:t>
-      </w:r>
-      <w:proofErr w:type="gramEnd"/>
-      <w:r>
-        <w:rPr>
-          <w:rStyle w:val="HTMLCode"/>
-          <w:color w:val="000000"/>
-        </w:rPr>
-        <w:t>) &lt; 6</w:t>
+        <w:t>while len(self.history) &lt; 6</w:t>
       </w:r>
       <w:r>
         <w:rPr>
@@ -4760,27 +4314,7 @@
           <w:sz w:val="19"/>
           <w:szCs w:val="19"/>
         </w:rPr>
-        <w:t xml:space="preserve"> Eight 4 </w:t>
-      </w:r>
-      <w:proofErr w:type="gramStart"/>
-      <w:r>
-        <w:rPr>
-          <w:rFonts w:ascii="Calibri" w:hAnsi="Calibri" w:cs="Calibri"/>
-          <w:color w:val="000000"/>
-          <w:sz w:val="19"/>
-          <w:szCs w:val="19"/>
-        </w:rPr>
-        <w:t>letter</w:t>
-      </w:r>
-      <w:proofErr w:type="gramEnd"/>
-      <w:r>
-        <w:rPr>
-          <w:rFonts w:ascii="Calibri" w:hAnsi="Calibri" w:cs="Calibri"/>
-          <w:color w:val="000000"/>
-          <w:sz w:val="19"/>
-          <w:szCs w:val="19"/>
-        </w:rPr>
-        <w:t xml:space="preserve"> and eight 6 letter words added to the in-memory list. A length prompt accepts 4, 5 or 6 (Enter means 5). The feedback logic already works for any length.</w:t>
+        <w:t xml:space="preserve"> Eight 4 letter and eight 6 letter words added to the in-memory list. A length prompt accepts 4, 5 or 6 (Enter means 5). The feedback logic already works for any length.</w:t>
       </w:r>
     </w:p>
     <w:p>
@@ -4856,23 +4390,7 @@
           <w:rStyle w:val="HTMLCode"/>
           <w:color w:val="000000"/>
         </w:rPr>
-        <w:t>play_</w:t>
-      </w:r>
-      <w:proofErr w:type="gramStart"/>
-      <w:r>
-        <w:rPr>
-          <w:rStyle w:val="HTMLCode"/>
-          <w:color w:val="000000"/>
-        </w:rPr>
-        <w:t>session(</w:t>
-      </w:r>
-      <w:proofErr w:type="gramEnd"/>
-      <w:r>
-        <w:rPr>
-          <w:rStyle w:val="HTMLCode"/>
-          <w:color w:val="000000"/>
-        </w:rPr>
-        <w:t>)</w:t>
+        <w:t>play_session()</w:t>
       </w:r>
       <w:r>
         <w:rPr>
@@ -4953,31 +4471,7 @@
           <w:sz w:val="14"/>
           <w:szCs w:val="14"/>
         </w:rPr>
-        <w:t xml:space="preserve">Ran: python -c with </w:t>
-      </w:r>
-      <w:proofErr w:type="gramStart"/>
-      <w:r>
-        <w:rPr>
-          <w:rFonts w:ascii="Calibri" w:eastAsia="Times New Roman" w:hAnsi="Calibri" w:cs="Calibri"/>
-          <w:i/>
-          <w:iCs/>
-          <w:color w:val="777777"/>
-          <w:sz w:val="14"/>
-          <w:szCs w:val="14"/>
-        </w:rPr>
-        <w:t>random.seed</w:t>
-      </w:r>
-      <w:proofErr w:type="gramEnd"/>
-      <w:r>
-        <w:rPr>
-          <w:rFonts w:ascii="Calibri" w:eastAsia="Times New Roman" w:hAnsi="Calibri" w:cs="Calibri"/>
-          <w:i/>
-          <w:iCs/>
-          <w:color w:val="777777"/>
-          <w:sz w:val="14"/>
-          <w:szCs w:val="14"/>
-        </w:rPr>
-        <w:t>(19) to see which words the seeded session picks (apple, then tree).</w:t>
+        <w:t>Ran: python -c with random.seed(19) to see which words the seeded session picks (apple, then tree).</w:t>
       </w:r>
     </w:p>
     <w:p>
@@ -5206,27 +4700,7 @@
           <w:sz w:val="19"/>
           <w:szCs w:val="19"/>
         </w:rPr>
-        <w:t xml:space="preserve">Verified. I checked every colour line against real Wordle rules and they are all correct. The session run in 06 uses </w:t>
-      </w:r>
-      <w:proofErr w:type="gramStart"/>
-      <w:r>
-        <w:rPr>
-          <w:rFonts w:ascii="Calibri" w:hAnsi="Calibri" w:cs="Calibri"/>
-          <w:color w:val="000000"/>
-          <w:sz w:val="19"/>
-          <w:szCs w:val="19"/>
-        </w:rPr>
-        <w:t>random.seed</w:t>
-      </w:r>
-      <w:proofErr w:type="gramEnd"/>
-      <w:r>
-        <w:rPr>
-          <w:rFonts w:ascii="Calibri" w:hAnsi="Calibri" w:cs="Calibri"/>
-          <w:color w:val="000000"/>
-          <w:sz w:val="19"/>
-          <w:szCs w:val="19"/>
-        </w:rPr>
-        <w:t>(19) so it can be repeated.</w:t>
+        <w:t>Verified. I checked every colour line against real Wordle rules and they are all correct. The session run in 06 uses random.seed(19) so it can be repeated.</w:t>
       </w:r>
     </w:p>
     <w:p>
@@ -5664,27 +5138,7 @@
           <w:sz w:val="16"/>
           <w:szCs w:val="16"/>
         </w:rPr>
-        <w:t xml:space="preserve">08: losing after six accepted guesses, then quitting a </w:t>
-      </w:r>
-      <w:proofErr w:type="gramStart"/>
-      <w:r>
-        <w:rPr>
-          <w:rFonts w:ascii="Calibri" w:eastAsia="Times New Roman" w:hAnsi="Calibri" w:cs="Calibri"/>
-          <w:color w:val="555555"/>
-          <w:sz w:val="16"/>
-          <w:szCs w:val="16"/>
-        </w:rPr>
-        <w:t>4 letter</w:t>
-      </w:r>
-      <w:proofErr w:type="gramEnd"/>
-      <w:r>
-        <w:rPr>
-          <w:rFonts w:ascii="Calibri" w:eastAsia="Times New Roman" w:hAnsi="Calibri" w:cs="Calibri"/>
-          <w:color w:val="555555"/>
-          <w:sz w:val="16"/>
-          <w:szCs w:val="16"/>
-        </w:rPr>
-        <w:t xml:space="preserve"> game.</w:t>
+        <w:t>08: losing after six accepted guesses, then quitting a 4 letter game.</w:t>
       </w:r>
     </w:p>
     <w:p>
@@ -5708,10 +5162,12 @@
           <w:sz w:val="14"/>
           <w:szCs w:val="14"/>
         </w:rPr>
-        <w:t>Claude copied the code (</w:t>
-      </w:r>
-      <w:proofErr w:type="gramStart"/>
-      <w:r>
+        <w:t>Claude copied the code (without .git and __pycache__), the screenshots and this PDF into the lab repo, and wrote the Lab 4 README.</w:t>
+      </w:r>
+    </w:p>
+    <w:p>
+      <w:pPr>
+        <w:divId w:val="1479104131"/>
         <w:rPr>
           <w:rFonts w:ascii="Calibri" w:eastAsia="Times New Roman" w:hAnsi="Calibri" w:cs="Calibri"/>
           <w:i/>
@@ -5720,9 +5176,7 @@
           <w:sz w:val="14"/>
           <w:szCs w:val="14"/>
         </w:rPr>
-        <w:t>without .git</w:t>
-      </w:r>
-      <w:proofErr w:type="gramEnd"/>
+      </w:pPr>
       <w:r>
         <w:rPr>
           <w:rFonts w:ascii="Calibri" w:eastAsia="Times New Roman" w:hAnsi="Calibri" w:cs="Calibri"/>
@@ -5732,55 +5186,7 @@
           <w:sz w:val="14"/>
           <w:szCs w:val="14"/>
         </w:rPr>
-        <w:t xml:space="preserve"> and __pycache__), the screenshots and this PDF into the lab repo, and wrote the Lab 4 README.</w:t>
-      </w:r>
-    </w:p>
-    <w:p>
-      <w:pPr>
-        <w:divId w:val="1479104131"/>
-        <w:rPr>
-          <w:rFonts w:ascii="Calibri" w:eastAsia="Times New Roman" w:hAnsi="Calibri" w:cs="Calibri"/>
-          <w:i/>
-          <w:iCs/>
-          <w:color w:val="777777"/>
-          <w:sz w:val="14"/>
-          <w:szCs w:val="14"/>
-        </w:rPr>
-      </w:pPr>
-      <w:r>
-        <w:rPr>
-          <w:rFonts w:ascii="Calibri" w:eastAsia="Times New Roman" w:hAnsi="Calibri" w:cs="Calibri"/>
-          <w:i/>
-          <w:iCs/>
-          <w:color w:val="777777"/>
-          <w:sz w:val="14"/>
-          <w:szCs w:val="14"/>
-        </w:rPr>
-        <w:t xml:space="preserve">Ran: git status --short -uall in the lab repo. </w:t>
-      </w:r>
-      <w:proofErr w:type="gramStart"/>
-      <w:r>
-        <w:rPr>
-          <w:rFonts w:ascii="Calibri" w:eastAsia="Times New Roman" w:hAnsi="Calibri" w:cs="Calibri"/>
-          <w:i/>
-          <w:iCs/>
-          <w:color w:val="777777"/>
-          <w:sz w:val="14"/>
-          <w:szCs w:val="14"/>
-        </w:rPr>
-        <w:t>Only .gitignore</w:t>
-      </w:r>
-      <w:proofErr w:type="gramEnd"/>
-      <w:r>
-        <w:rPr>
-          <w:rFonts w:ascii="Calibri" w:eastAsia="Times New Roman" w:hAnsi="Calibri" w:cs="Calibri"/>
-          <w:i/>
-          <w:iCs/>
-          <w:color w:val="777777"/>
-          <w:sz w:val="14"/>
-          <w:szCs w:val="14"/>
-        </w:rPr>
-        <w:t>, README.md and the lab4-vibecoding files show up, no handout or __pycache__.</w:t>
+        <w:t>Ran: git status --short -uall in the lab repo. Only .gitignore, README.md and the lab4-vibecoding files show up, no handout or __pycache__.</w:t>
       </w:r>
     </w:p>
     <w:p>
@@ -5957,23 +5363,7 @@
           <w:rStyle w:val="HTMLCode"/>
           <w:color w:val="000000"/>
         </w:rPr>
-        <w:t xml:space="preserve">  screenshots</w:t>
-      </w:r>
-      <w:proofErr w:type="gramStart"/>
-      <w:r>
-        <w:rPr>
-          <w:rStyle w:val="HTMLCode"/>
-          <w:color w:val="000000"/>
-        </w:rPr>
-        <w:t>/  01</w:t>
-      </w:r>
-      <w:proofErr w:type="gramEnd"/>
-      <w:r>
-        <w:rPr>
-          <w:rStyle w:val="HTMLCode"/>
-          <w:color w:val="000000"/>
-        </w:rPr>
-        <w:t>-02 before, 03-08 after</w:t>
+        <w:t xml:space="preserve">  screenshots/  01-02 before, 03-08 after</w:t>
       </w:r>
     </w:p>
     <w:p>
@@ -6102,23 +5492,7 @@
           <w:rStyle w:val="HTMLCode"/>
           <w:color w:val="000000"/>
         </w:rPr>
-        <w:t xml:space="preserve">git </w:t>
-      </w:r>
-      <w:proofErr w:type="gramStart"/>
-      <w:r>
-        <w:rPr>
-          <w:rStyle w:val="HTMLCode"/>
-          <w:color w:val="000000"/>
-        </w:rPr>
-        <w:t>add .gitignore</w:t>
-      </w:r>
-      <w:proofErr w:type="gramEnd"/>
-      <w:r>
-        <w:rPr>
-          <w:rStyle w:val="HTMLCode"/>
-          <w:color w:val="000000"/>
-        </w:rPr>
-        <w:t xml:space="preserve"> README.md lab4-vibecoding</w:t>
+        <w:t>git add .gitignore README.md lab4-vibecoding</w:t>
       </w:r>
     </w:p>
     <w:p>

</xml_diff>